<commit_message>
Refresh Rebirth draft for OASTL cutover
</commit_message>
<xml_diff>
--- a/public/drafts/school-trust-rebirth-latest.docx
+++ b/public/drafts/school-trust-rebirth-latest.docx
@@ -108,7 +108,7 @@
           <w:rFonts w:ascii="Calibri" w:hAnsi="Calibri"/>
           <w:color w:val="1B2B33"/>
         </w:rPr>
-        <w:t>Public working draft. Not legal advice. Not approved by any organization. No person or institution is committed by this draft.</w:t>
+        <w:t>Public working draft. Not legal advice. Not approved by any organization. Reflects the current operating decision to move OASTL's public website to the rebuilt Oregon action site.</w:t>
       </w:r>
     </w:p>
     <w:tbl>
@@ -149,7 +149,7 @@
                 <w:rFonts w:ascii="Calibri" w:hAnsi="Calibri"/>
                 <w:color w:val="183038"/>
               </w:rPr>
-              <w:t>Make school trusts visible, enforceable, and worth fighting for. This brief explains the institutional roles, Oregon-first path, publication family, proposed public websites, stable book links, and decisions needed before the work is carried outward.</w:t>
+              <w:t>Make school trusts visible, enforceable, and worth fighting for. This brief explains the institutional roles, Oregon-first path, publication family, public websites, stable book links, and decisions needed before the work is carried outward.</w:t>
             </w:r>
           </w:p>
         </w:tc>
@@ -492,7 +492,7 @@
           <w:rFonts w:ascii="Calibri" w:hAnsi="Calibri"/>
           <w:color w:val="183038"/>
         </w:rPr>
-        <w:t>There are two different website questions here: where the public already goes today, and where the improved material currently lives. For ASTL, the familiar public address is schooltrustlands.org. The rebuilt working successor now lives at schooltrustlands.net. For OASTL, the familiar public address is oastl.org. The rebuilt Oregon working site now lives at oastl-oregon.drdavesullivan.workers.dev. The Library remains separate from both advocacy sites, at schooltrusts.org, because its job is to keep the public record rather than advocate for one organization.</w:t>
+        <w:t>The public website structure now has three lanes. The Library remains separate at schooltrusts.org because its job is to keep the neutral public record. OASTL's familiar public address is oastl.org, and the current operational decision is to move that address to the rebuilt Oregon action site and retire the old Google Sites page. ASTL's familiar public address is schooltrustlands.org; the rebuilt national advocacy successor now lives at schooltrustlands.net until Tonia and the responsible ASTL decision-makers decide when and how to move approved material to the familiar .org address.</w:t>
       </w:r>
     </w:p>
     <w:p>
@@ -501,7 +501,7 @@
           <w:rFonts w:ascii="Calibri" w:hAnsi="Calibri"/>
           <w:color w:val="183038"/>
         </w:rPr>
-        <w:t>The intended ASTL move should be stated plainly: after Tonia and the responsible ASTL decision-makers review and approve the new material, schooltrustlands.org should receive the improved ASTL site material that is now visible at schooltrustlands.net. That could happen by pointing the familiar .org address to the new build, by migrating the material, or by another technical route. The reader does not need the mechanics yet. The reader does need to understand the goal: the address people already know, schooltrustlands.org, should eventually carry the stronger public-facing ASTL material.</w:t>
+        <w:t>The OASTL decision matters because it supplies the first adoption example. OASTL is no longer merely considering whether a new site might become useful. It is choosing one public home for the Oregon campaign, one correction path, and one maintenance responsibility. That is exactly the discipline this rebirth effort asks other institutions to adopt: use the better public record, retire the weaker public site, and make the ongoing work visible enough to maintain.</w:t>
       </w:r>
     </w:p>
     <w:p>
@@ -510,7 +510,7 @@
           <w:rFonts w:ascii="Calibri" w:hAnsi="Calibri"/>
           <w:color w:val="183038"/>
         </w:rPr>
-        <w:t>The .net site should not vanish in that move. It can remain live as the working build, continuity address, preview site, or technical backup while ASTL decides exactly how it wants to manage domains, redirects, edits, archives, and future improvements. In other words, the choice is not 'old .org or new .net.' The likely path is: keep the new .net work alive, put its approved material where ASTL's public audience already looks, and maintain a clear correction-and-update process going forward.</w:t>
+        <w:t>The job of oastl.org should be Oregon action. It should explain the Oregon promise, the litigation context, Oregon's school-trust forest failure, the citizen-repair path, board-facing materials, and useful next steps for Oregon parents, students, lawyers, librarians, school districts, public officials, and supporters. It should link deeper source-checking to the Library rather than trying to become the Library itself.</w:t>
       </w:r>
     </w:p>
     <w:p>
@@ -519,7 +519,7 @@
           <w:rFonts w:ascii="Calibri" w:hAnsi="Calibri"/>
           <w:color w:val="183038"/>
         </w:rPr>
-        <w:t>The parallel OASTL question is similar but Oregon-specific. If OASTL approves the new Oregon site, the material now at oastl-oregon.drdavesullivan.workers.dev should eventually be carried through oastl.org or whatever address OASTL chooses as its public home. Until that decision is made, the Oregon site is a working replacement candidate, not a claim that the board has already adopted it.</w:t>
+        <w:t>The ASTL question is now different. For ASTL, schooltrustlands.net remains the working successor and preview address. The likely path is still to keep the .net work alive, move approved national advocacy material onto schooltrustlands.org when ASTL is ready, and then stop maintaining two competing public ASTL sites. The .net site can remain useful as a working build, continuity address, preview site, or technical backup, but it should not become a second public front door that confuses readers about where to go.</w:t>
       </w:r>
     </w:p>
     <w:p>
@@ -528,7 +528,7 @@
           <w:rFonts w:ascii="Calibri" w:hAnsi="Calibri"/>
           <w:color w:val="183038"/>
         </w:rPr>
-        <w:t>The new sites are not decorations for the books and packets. They are proposed public front doors for different jobs. The OASTL site would be the Oregon action site: litigation context, Oregon citizen repair, board-facing materials, Oregon story, and ways for Oregon parents, students, lawyers, librarians, school districts, and supporters to enter the work. The ASTL site would be the national advocacy site: state allies, national coalition materials, replication tools, partner briefings, and a way for the Oregon demonstration to travel without making every national reader start in Oregon.</w:t>
+        <w:t>The new sites are not decorations for the books and packets. They are public front doors for different jobs. OASTL's site is the Oregon action site. ASTL's site is the national advocacy and coalition site. The Library site is the neutral record and source-checking site. Keeping those roles separate makes the whole effort easier to trust.</w:t>
       </w:r>
     </w:p>
     <w:p>
@@ -555,16 +555,7 @@
           <w:rFonts w:ascii="Calibri" w:hAnsi="Calibri"/>
           <w:color w:val="183038"/>
         </w:rPr>
-        <w:t>That is also why the sites should be adopted deliberately. Until OASTL and ASTL review and approve them, the new sites should be treated as working replacement candidates, not as official organizational acts. The question for each board or responsible leader is not, 'Do we like that a site was built?' The question is, 'Does this site now serve our public mission better than the site we have, and are we ready to maintain it as our public front door?'</w:t>
-      </w:r>
-    </w:p>
-    <w:p>
-      <w:r>
-        <w:rPr>
-          <w:rFonts w:ascii="Calibri" w:hAnsi="Calibri"/>
-          <w:color w:val="183038"/>
-        </w:rPr>
-        <w:t>That does not mean the weaker site should stay in public use for months while everyone studies the question. The transition should be short and disciplined. Review the new site beside the current site; identify only the changes that truly must be made before launch; decide who owns content, corrections, contact routes, and updates; then move the familiar public address to the approved material. After that, maintain one public ASTL site, not two. The old site should be archived or redirected, and the .net site should remain useful as a working build, preview address, or backup, not as a second public front door competing for attention.</w:t>
+        <w:t>As oastl.org becomes the public Oregon front door, the remaining question is not whether the site is a good prototype. The remaining question is maintenance: who owns content changes, corrections, contact routes, donation or membership links, launch announcements, archived old-site material, and the review rhythm after launch. That is the work that turns a better website into a dependable public institution.</w:t>
       </w:r>
     </w:p>
     <w:p>
@@ -582,6 +573,15 @@
           <w:color w:val="183038"/>
         </w:rPr>
         <w:t>Separating the Library from OASTL does not weaken the Oregon-first strategy. It makes it cleaner.</w:t>
+      </w:r>
+    </w:p>
+    <w:p>
+      <w:r>
+        <w:rPr>
+          <w:rFonts w:ascii="Calibri" w:hAnsi="Calibri"/>
+          <w:color w:val="183038"/>
+        </w:rPr>
+        <w:t>The oastl.org transition strengthens that Oregon-first strategy. It gives the Oregon work a public front door at the address people already know, rather than leaving the stronger material on a preview address that only insiders understand. That makes Oregon not just the first legal test, but the first public-infrastructure test for the whole school-trust rebirth.</w:t>
       </w:r>
     </w:p>
     <w:p>
@@ -3798,14 +3798,14 @@
           <w:b/>
           <w:color w:val="22598A"/>
         </w:rPr>
-        <w:t xml:space="preserve">Website adoption: </w:t>
+        <w:t xml:space="preserve">Website transition and maintenance: </w:t>
       </w:r>
       <w:r>
         <w:rPr>
           <w:rFonts w:ascii="Calibri" w:hAnsi="Calibri"/>
           <w:color w:val="183038"/>
         </w:rPr>
-        <w:t xml:space="preserve">Should ASTL move the approved material now at schooltrustlands.net onto the familiar schooltrustlands.org public address, keep .net alive as a working or continuity site, and then stop maintaining two competing public ASTL sites? </w:t>
+        <w:t xml:space="preserve">Now that the operating decision is to move oastl.org to the rebuilt Oregon action site and retire the old Google Sites page, who owns launch review, correction intake, contact routes, donation or membership links, archived old-site material, and the post-launch update rhythm? </w:t>
       </w:r>
       <w:r>
         <w:rPr>
@@ -3820,7 +3820,7 @@
           <w:rFonts w:ascii="Calibri" w:hAnsi="Calibri"/>
           <w:color w:val="183038"/>
         </w:rPr>
-        <w:t>No organization should be asked to use a new site merely because it exists, but once the new site is materially better and approved, the transition should be prompt: one public home, one correction path, one maintenance responsibility.</w:t>
+        <w:t>Treat OASTL as a launch-and-maintenance question, not a hypothetical adoption question. Treat ASTL separately: schooltrustlands.net remains the working successor until ASTL decides when and how approved material should move to schooltrustlands.org.</w:t>
       </w:r>
     </w:p>
     <w:p>
@@ -3911,7 +3911,7 @@
           <w:rFonts w:ascii="Calibri" w:hAnsi="Calibri"/>
           <w:color w:val="183038"/>
         </w:rPr>
-        <w:t>Review the website replacement section and ask whether each proposed site should be revised, adopted as the public front door, or held until board and partner approval.</w:t>
+        <w:t>Review the website replacement section with the new split in mind: OASTL is now a launch-and-maintenance question; ASTL remains an adoption, domain, and approval question.</w:t>
       </w:r>
     </w:p>
     <w:p>
@@ -4530,6 +4530,48 @@
     </w:p>
     <w:p>
       <w:pPr>
+        <w:pStyle w:val="ListBullet"/>
+      </w:pPr>
+      <w:hyperlink r:id="rId50">
+        <w:r>
+          <w:rPr>
+            <w:color w:val="0563C1"/>
+            <w:u w:val="single"/>
+          </w:rPr>
+          <w:t>OASTL public site</w:t>
+        </w:r>
+      </w:hyperlink>
+      <w:r>
+        <w:rPr>
+          <w:rFonts w:ascii="Calibri" w:hAnsi="Calibri"/>
+          <w:color w:val="183038"/>
+        </w:rPr>
+        <w:t xml:space="preserve"> - Familiar Oregon public address for the rebuilt Oregon action site during and after the cutover.</w:t>
+      </w:r>
+    </w:p>
+    <w:p>
+      <w:pPr>
+        <w:pStyle w:val="ListBullet"/>
+      </w:pPr>
+      <w:hyperlink r:id="rId51">
+        <w:r>
+          <w:rPr>
+            <w:color w:val="0563C1"/>
+            <w:u w:val="single"/>
+          </w:rPr>
+          <w:t>OASTL rebuilt preview site</w:t>
+        </w:r>
+      </w:hyperlink>
+      <w:r>
+        <w:rPr>
+          <w:rFonts w:ascii="Calibri" w:hAnsi="Calibri"/>
+          <w:color w:val="183038"/>
+        </w:rPr>
+        <w:t xml:space="preserve"> - Preview/technical origin for the rebuilt Oregon action site during the transition.</w:t>
+      </w:r>
+    </w:p>
+    <w:p>
+      <w:pPr>
         <w:pStyle w:val="Heading1"/>
       </w:pPr>
       <w:r>
@@ -4540,7 +4582,7 @@
       <w:pPr>
         <w:pStyle w:val="ListBullet"/>
       </w:pPr>
-      <w:hyperlink r:id="rId50">
+      <w:hyperlink r:id="rId52">
         <w:r>
           <w:rPr>
             <w:color w:val="0563C1"/>
@@ -4561,7 +4603,7 @@
       <w:pPr>
         <w:pStyle w:val="ListBullet"/>
       </w:pPr>
-      <w:hyperlink r:id="rId51">
+      <w:hyperlink r:id="rId53">
         <w:r>
           <w:rPr>
             <w:color w:val="0563C1"/>
@@ -4582,7 +4624,7 @@
       <w:pPr>
         <w:pStyle w:val="ListBullet"/>
       </w:pPr>
-      <w:hyperlink r:id="rId52">
+      <w:hyperlink r:id="rId54">
         <w:r>
           <w:rPr>
             <w:color w:val="0563C1"/>
@@ -4603,7 +4645,7 @@
       <w:pPr>
         <w:pStyle w:val="ListBullet"/>
       </w:pPr>
-      <w:hyperlink r:id="rId53">
+      <w:hyperlink r:id="rId55">
         <w:r>
           <w:rPr>
             <w:color w:val="0563C1"/>
@@ -4624,7 +4666,7 @@
       <w:pPr>
         <w:pStyle w:val="ListBullet"/>
       </w:pPr>
-      <w:hyperlink r:id="rId54">
+      <w:hyperlink r:id="rId56">
         <w:r>
           <w:rPr>
             <w:color w:val="0563C1"/>
@@ -4645,7 +4687,7 @@
       <w:pPr>
         <w:pStyle w:val="ListBullet"/>
       </w:pPr>
-      <w:hyperlink r:id="rId55">
+      <w:hyperlink r:id="rId57">
         <w:r>
           <w:rPr>
             <w:color w:val="0563C1"/>
@@ -4666,7 +4708,7 @@
       <w:pPr>
         <w:pStyle w:val="ListBullet"/>
       </w:pPr>
-      <w:hyperlink r:id="rId56">
+      <w:hyperlink r:id="rId58">
         <w:r>
           <w:rPr>
             <w:color w:val="0563C1"/>
@@ -4687,7 +4729,7 @@
       <w:pPr>
         <w:pStyle w:val="ListBullet"/>
       </w:pPr>
-      <w:hyperlink r:id="rId57">
+      <w:hyperlink r:id="rId59">
         <w:r>
           <w:rPr>
             <w:color w:val="0563C1"/>
@@ -4708,7 +4750,7 @@
       <w:pPr>
         <w:pStyle w:val="ListBullet"/>
       </w:pPr>
-      <w:hyperlink r:id="rId58">
+      <w:hyperlink r:id="rId60">
         <w:r>
           <w:rPr>
             <w:color w:val="0563C1"/>
@@ -4729,7 +4771,7 @@
       <w:pPr>
         <w:pStyle w:val="ListBullet"/>
       </w:pPr>
-      <w:hyperlink r:id="rId59">
+      <w:hyperlink r:id="rId61">
         <w:r>
           <w:rPr>
             <w:color w:val="0563C1"/>
@@ -4750,7 +4792,7 @@
       <w:pPr>
         <w:pStyle w:val="ListBullet"/>
       </w:pPr>
-      <w:hyperlink r:id="rId60">
+      <w:hyperlink r:id="rId62">
         <w:r>
           <w:rPr>
             <w:color w:val="0563C1"/>
@@ -4771,7 +4813,7 @@
       <w:pPr>
         <w:pStyle w:val="ListBullet"/>
       </w:pPr>
-      <w:hyperlink r:id="rId61">
+      <w:hyperlink r:id="rId63">
         <w:r>
           <w:rPr>
             <w:color w:val="0563C1"/>
@@ -4792,7 +4834,7 @@
       <w:pPr>
         <w:pStyle w:val="ListBullet"/>
       </w:pPr>
-      <w:hyperlink r:id="rId62">
+      <w:hyperlink r:id="rId64">
         <w:r>
           <w:rPr>
             <w:color w:val="0563C1"/>
@@ -4813,7 +4855,7 @@
       <w:pPr>
         <w:pStyle w:val="ListBullet"/>
       </w:pPr>
-      <w:hyperlink r:id="rId63">
+      <w:hyperlink r:id="rId65">
         <w:r>
           <w:rPr>
             <w:color w:val="0563C1"/>
@@ -4834,7 +4876,7 @@
       <w:pPr>
         <w:pStyle w:val="ListBullet"/>
       </w:pPr>
-      <w:hyperlink r:id="rId64">
+      <w:hyperlink r:id="rId66">
         <w:r>
           <w:rPr>
             <w:color w:val="0563C1"/>
@@ -4855,7 +4897,7 @@
       <w:pPr>
         <w:pStyle w:val="ListBullet"/>
       </w:pPr>
-      <w:hyperlink r:id="rId65">
+      <w:hyperlink r:id="rId67">
         <w:r>
           <w:rPr>
             <w:color w:val="0563C1"/>
@@ -4876,7 +4918,7 @@
       <w:pPr>
         <w:pStyle w:val="ListBullet"/>
       </w:pPr>
-      <w:hyperlink r:id="rId66">
+      <w:hyperlink r:id="rId68">
         <w:r>
           <w:rPr>
             <w:color w:val="0563C1"/>
@@ -4897,7 +4939,7 @@
       <w:pPr>
         <w:pStyle w:val="ListBullet"/>
       </w:pPr>
-      <w:hyperlink r:id="rId67">
+      <w:hyperlink r:id="rId69">
         <w:r>
           <w:rPr>
             <w:color w:val="0563C1"/>
@@ -4918,7 +4960,7 @@
       <w:pPr>
         <w:pStyle w:val="ListBullet"/>
       </w:pPr>
-      <w:hyperlink r:id="rId68">
+      <w:hyperlink r:id="rId70">
         <w:r>
           <w:rPr>
             <w:color w:val="0563C1"/>
@@ -4939,7 +4981,7 @@
       <w:pPr>
         <w:pStyle w:val="ListBullet"/>
       </w:pPr>
-      <w:hyperlink r:id="rId69">
+      <w:hyperlink r:id="rId71">
         <w:r>
           <w:rPr>
             <w:color w:val="0563C1"/>
@@ -4960,7 +5002,7 @@
       <w:pPr>
         <w:pStyle w:val="ListBullet"/>
       </w:pPr>
-      <w:hyperlink r:id="rId70">
+      <w:hyperlink r:id="rId72">
         <w:r>
           <w:rPr>
             <w:color w:val="0563C1"/>
@@ -4981,7 +5023,7 @@
       <w:pPr>
         <w:pStyle w:val="ListBullet"/>
       </w:pPr>
-      <w:hyperlink r:id="rId71">
+      <w:hyperlink r:id="rId73">
         <w:r>
           <w:rPr>
             <w:color w:val="0563C1"/>
@@ -4996,6 +5038,27 @@
           <w:color w:val="183038"/>
         </w:rPr>
         <w:t xml:space="preserve"> - Template for durable /writing/books/... pages so outside links survive draft-file moves.</w:t>
+      </w:r>
+    </w:p>
+    <w:p>
+      <w:pPr>
+        <w:pStyle w:val="ListBullet"/>
+      </w:pPr>
+      <w:hyperlink r:id="rId74">
+        <w:r>
+          <w:rPr>
+            <w:color w:val="0563C1"/>
+            <w:u w:val="single"/>
+          </w:rPr>
+          <w:t>OASTL.org public-site review</w:t>
+        </w:r>
+      </w:hyperlink>
+      <w:r>
+        <w:rPr>
+          <w:rFonts w:ascii="Calibri" w:hAnsi="Calibri"/>
+          <w:color w:val="183038"/>
+        </w:rPr>
+        <w:t xml:space="preserve"> - June 9 review concluding that the rebuilt OASTL site should become Oregon's public-demonstration/action site rather than a simple modernization of the old site.</w:t>
       </w:r>
     </w:p>
     <w:p>
@@ -5040,7 +5103,7 @@
         <w:color w:val="676A70"/>
         <w:sz w:val="17"/>
       </w:rPr>
-      <w:t>Public working draft - V4.5.7 - June 9, 2026</w:t>
+      <w:t>Public working draft - V4.5.8 - June 9, 2026</w:t>
     </w:r>
   </w:p>
 </w:ftr>

</xml_diff>

<commit_message>
Sync Writing Room book drafts
</commit_message>
<xml_diff>
--- a/public/drafts/school-trust-rebirth-latest.docx
+++ b/public/drafts/school-trust-rebirth-latest.docx
@@ -108,7 +108,7 @@
           <w:rFonts w:ascii="Calibri" w:hAnsi="Calibri"/>
           <w:color w:val="1B2B33"/>
         </w:rPr>
-        <w:t>Public working draft. Not legal advice. Not approved by any organization. Reflects the current operating decision to move OASTL's public website to the rebuilt Oregon action site.</w:t>
+        <w:t>Public working draft. Not legal advice. Not approved by any organization. Reflects the current operating decision to move OASTL's public website to the rebuilt Oregon action site. Adds a legal-review gate before adoption or external legal use.</w:t>
       </w:r>
     </w:p>
     <w:tbl>
@@ -149,7 +149,7 @@
                 <w:rFonts w:ascii="Calibri" w:hAnsi="Calibri"/>
                 <w:color w:val="183038"/>
               </w:rPr>
-              <w:t>Make school trusts visible, enforceable, and worth fighting for. This brief explains the institutional roles, Oregon-first path, publication family, public websites, stable book links, and decisions needed before the work is carried outward.</w:t>
+              <w:t>Make school trusts visible, enforceable, and worth fighting for. This brief explains the institutional roles, Oregon-first path, legal-review gate, publication family, public websites, stable book links, and decisions needed before the work is carried outward.</w:t>
             </w:r>
           </w:p>
         </w:tc>
@@ -326,6 +326,59 @@
           <w:color w:val="183038"/>
         </w:rPr>
         <w:t>That makes the next step more delicate, not less. Finished-looking objects can accidentally imply that institutional decisions have already been made. They have not. The build phase has reached the point where it is now useful to ask how OASTL, ASTL, and the Library should relate to one another, what each should publish, and how this work should be governed before it is carried outward.</w:t>
+      </w:r>
+    </w:p>
+    <w:p>
+      <w:pPr>
+        <w:pStyle w:val="Heading1"/>
+      </w:pPr>
+      <w:r>
+        <w:t>Legal Review Before Adoption</w:t>
+      </w:r>
+    </w:p>
+    <w:p>
+      <w:r>
+        <w:rPr>
+          <w:rFonts w:ascii="Calibri" w:hAnsi="Calibri"/>
+          <w:color w:val="183038"/>
+        </w:rPr>
+        <w:t>The work should not become official by accident. The drafts, websites, booklets, model-law materials, and source records can be public and inspectable, but that is different from saying that a lawyer, board, campaign, or organization has approved them.</w:t>
+      </w:r>
+    </w:p>
+    <w:p>
+      <w:r>
+        <w:rPr>
+          <w:rFonts w:ascii="Calibri" w:hAnsi="Calibri"/>
+          <w:color w:val="183038"/>
+        </w:rPr>
+        <w:t>Before any part of this work is used as an OASTL legal position, ASTL national position, legislative proposal, initiative packet, litigation-support document, board packet, fundraising representation, or public launch statement, the legal team should review the relevant piece and say what may be used, what needs revision, what needs a caveat, and what should stay out of public advocacy for now.</w:t>
+      </w:r>
+    </w:p>
+    <w:p>
+      <w:r>
+        <w:rPr>
+          <w:rFonts w:ascii="Calibri" w:hAnsi="Calibri"/>
+          <w:color w:val="183038"/>
+        </w:rPr>
+        <w:t>That review has three jobs. First, protect the pending and possible cases: no public document should accidentally give up protected legal confidentiality, misstate a filing, hurt a claim, or promise a court-ordered fix the legal team is not prepared to defend. Second, check the legal machinery: who may sue, what financial records must be produced, what fiduciary duties apply, what fixes a court may order, model statutory language, constitutional fallback language, and court-process analogies should be reviewed by lawyers before they are treated as approved. Third, protect institutional consent: no document should make OASTL, ASTL, the Library, Margaret, Tonia, Daniel, Natalie, Laura, Bob, or any other person appear to endorse more than they have actually approved.</w:t>
+      </w:r>
+    </w:p>
+    <w:p>
+      <w:r>
+        <w:rPr>
+          <w:rFonts w:ascii="Calibri" w:hAnsi="Calibri"/>
+          <w:color w:val="183038"/>
+        </w:rPr>
+        <w:t>Legal review should be structured, not vague. The right question is not 'Has a lawyer looked at all of this?' The right question is: 'For this specific use, which parts need legal review before release, who is reviewing them, what decision did they make, and what caveats or changes must travel with the document?'</w:t>
+      </w:r>
+    </w:p>
+    <w:p>
+      <w:r>
+        <w:rPr>
+          <w:rFonts w:ascii="Calibri" w:hAnsi="Calibri"/>
+          <w:color w:val="183038"/>
+        </w:rPr>
+        <w:t>This should not turn the legal team into the editor of every historical paragraph, source card, book cover, or public explanation. The Library can keep building a neutral, source-linked record. OASTL can keep building public understanding. But when the work crosses from working draft into approved legal position, campaign material, filed support, or organizational commitment, legal review is the release gate.</w:t>
       </w:r>
     </w:p>
     <w:p>
@@ -3860,6 +3913,41 @@
     </w:p>
     <w:p>
       <w:pPr>
+        <w:pStyle w:val="ListBullet"/>
+      </w:pPr>
+      <w:r>
+        <w:rPr>
+          <w:rFonts w:ascii="Calibri" w:hAnsi="Calibri"/>
+          <w:b/>
+          <w:color w:val="22598A"/>
+        </w:rPr>
+        <w:t xml:space="preserve">Legal review gate: </w:t>
+      </w:r>
+      <w:r>
+        <w:rPr>
+          <w:rFonts w:ascii="Calibri" w:hAnsi="Calibri"/>
+          <w:color w:val="183038"/>
+        </w:rPr>
+        <w:t xml:space="preserve">Which uses of the Rebirth work require legal-team review before release, and who records the review decision? </w:t>
+      </w:r>
+      <w:r>
+        <w:rPr>
+          <w:rFonts w:ascii="Calibri" w:hAnsi="Calibri"/>
+          <w:b/>
+          <w:color w:val="5C5C5C"/>
+        </w:rPr>
+        <w:t xml:space="preserve">Guardrail: </w:t>
+      </w:r>
+      <w:r>
+        <w:rPr>
+          <w:rFonts w:ascii="Calibri" w:hAnsi="Calibri"/>
+          <w:color w:val="183038"/>
+        </w:rPr>
+        <w:t>Do not ask lawyers to approve every working draft. Do require review before legal positions, model-law text, initiative packets, litigation-sensitive statements, organizational commitments, fundraising representations, or public launch statements are treated as approved.</w:t>
+      </w:r>
+    </w:p>
+    <w:p>
+      <w:pPr>
         <w:pStyle w:val="Heading1"/>
       </w:pPr>
       <w:r>
@@ -3924,6 +4012,18 @@
           <w:color w:val="183038"/>
         </w:rPr>
         <w:t>Open the Make School Trusts for Schools citizen-repair booklet and ask whether it belongs on the OASTL/Oregon shelf as the citizen repair companion.</w:t>
+      </w:r>
+    </w:p>
+    <w:p>
+      <w:pPr>
+        <w:pStyle w:val="ListNumber"/>
+      </w:pPr>
+      <w:r>
+        <w:rPr>
+          <w:rFonts w:ascii="Calibri" w:hAnsi="Calibri"/>
+          <w:color w:val="183038"/>
+        </w:rPr>
+        <w:t>For each item someone wants to use externally, decide whether it is a working public draft, an organizational position, a legal position, campaign material, or litigation-sensitive material; send only the last four categories through the legal-review gate before release.</w:t>
       </w:r>
     </w:p>
     <w:p>
@@ -5103,7 +5203,7 @@
         <w:color w:val="676A70"/>
         <w:sz w:val="17"/>
       </w:rPr>
-      <w:t>Public working draft - V4.5.8 - June 9, 2026</w:t>
+      <w:t>Public working draft - V4.5.9 - June 9, 2026</w:t>
     </w:r>
   </w:p>
 </w:ftr>

</xml_diff>